<commit_message>
Update student Word guide to match screenshot exact text and layout
</commit_message>
<xml_diff>
--- a/deploy/public/Guia_Estudo_Assincrono_Estudante.docx
+++ b/deploy/public/Guia_Estudo_Assincrono_Estudante.docx
@@ -4,7 +4,7 @@
   <w:body>
     <w:p>
       <w:pPr>
-        <w:spacing w:after="240"/>
+        <w:spacing w:before="0" w:after="240"/>
         <w:jc w:val="center"/>
       </w:pPr>
       <w:r>
@@ -44,7 +44,7 @@
     </w:p>
     <w:p>
       <w:pPr>
-        <w:spacing w:after="120"/>
+        <w:spacing w:after="80"/>
         <w:jc w:val="center"/>
       </w:pPr>
       <w:r>
@@ -53,14 +53,14 @@
           <w:b/>
           <w:i w:val="0"/>
           <w:color w:val="0284C7"/>
-          <w:sz w:val="30"/>
+          <w:sz w:val="28"/>
         </w:rPr>
-        <w:t>MANUAL DE ESTUDO ASSÍNCRONO E ACESSO AO AMBIENTE VIRTUAL</w:t>
+        <w:t>MANUAL DE ACESSO AO AMBIENTE VIRTUAL</w:t>
       </w:r>
     </w:p>
     <w:p>
       <w:pPr>
-        <w:spacing w:after="480"/>
+        <w:spacing w:after="80"/>
         <w:jc w:val="center"/>
       </w:pPr>
       <w:r>
@@ -72,20 +72,50 @@
           <w:sz w:val="22"/>
         </w:rPr>
         <w:t>Diretrizes de Acompanhamento de Gravações de Aulas e Interações Individuais</w:t>
-        <w:br/>
-        <w:t>MBA em Inteligência Artificial Aplicada à Saúde</w:t>
       </w:r>
     </w:p>
     <w:p>
       <w:pPr>
-        <w:spacing w:after="240"/>
+        <w:spacing w:after="80"/>
+        <w:jc w:val="center"/>
+      </w:pPr>
+      <w:r>
+        <w:rPr>
+          <w:rFonts w:ascii="Arial" w:hAnsi="Arial"/>
+          <w:b/>
+          <w:i w:val="0"/>
+          <w:color w:val="000000"/>
+          <w:sz w:val="22"/>
+        </w:rPr>
+        <w:t>Disciplina: Avaliação de Riscos e Investimentos com ROI</w:t>
+      </w:r>
+    </w:p>
+    <w:p>
+      <w:pPr>
+        <w:spacing w:after="360"/>
+        <w:jc w:val="center"/>
+      </w:pPr>
+      <w:r>
+        <w:rPr>
+          <w:rFonts w:ascii="Arial" w:hAnsi="Arial"/>
+          <w:b/>
+          <w:i w:val="0"/>
+          <w:color w:val="000000"/>
+          <w:sz w:val="22"/>
+        </w:rPr>
+        <w:t>Profa. Dra. Faila Santos</w:t>
+      </w:r>
+    </w:p>
+    <w:p>
+      <w:pPr>
+        <w:spacing w:after="360"/>
         <w:jc w:val="center"/>
       </w:pPr>
       <w:r>
         <w:rPr>
           <w:color w:val="3B5166"/>
         </w:rPr>
-        <w:t>――――――――――――――――――――――――――――――――――――――――</w:t>
+        <w:t>―――――――――――――――――――――――――――――――――――――――――――――</w:t>
       </w:r>
     </w:p>
     <w:p>
@@ -101,7 +131,7 @@
           <w:color w:val="000000"/>
           <w:sz w:val="22"/>
         </w:rPr>
-        <w:t>Este manual destina-se aos discentes que necessitem realizar o acompanhamento acadêmico de forma assíncrona. A metodologia do MBA em IA na Saúde baseia-se em aprendizagem ativa síncrona. Portanto, a visualização da gravação deve ser rigorosamente integrada ao uso do portal virtual de simulação de ROI para que o aluno execute e valide os conceitos práticos apresentados pela docente.</w:t>
+        <w:t>Este manual destina-se aos discentes que necessitem realizar o acompanhamento acadêmico de forma assíncrona. A metodologia baseia-se em aprendizagem ativa síncrona. Portanto, a visualização da gravação deve ser rigorosamente integrada ao uso do portal virtual de simulação de ROI para que o aluno execute e valide os conceitos práticos apresentados.</w:t>
       </w:r>
     </w:p>
     <w:p>
@@ -115,9 +145,9 @@
           <w:b/>
           <w:i w:val="0"/>
           <w:color w:val="0284C7"/>
-          <w:sz w:val="26"/>
+          <w:sz w:val="25"/>
         </w:rPr>
-        <w:t>1. Procedimento de Acesso e Autenticação no Portal</w:t>
+        <w:t>1. Acesso e Autenticação no Portal</w:t>
       </w:r>
     </w:p>
     <w:p>
@@ -160,7 +190,18 @@
           <w:color w:val="000000"/>
           <w:sz w:val="22"/>
         </w:rPr>
-        <w:t>Abra o navegador e acesse o endereço eletrônico do portal virtual fornecido pela docente.</w:t>
+        <w:t xml:space="preserve">Abra o navegador e acesse o endereço eletrônico do portal virtual </w:t>
+      </w:r>
+      <w:r>
+        <w:rPr>
+          <w:rFonts w:ascii="Arial" w:hAnsi="Arial"/>
+          <w:b/>
+          <w:i w:val="0"/>
+          <w:color w:val="0284C7"/>
+          <w:sz w:val="22"/>
+        </w:rPr>
+        <w:br/>
+        <w:t>https://roi-learning-lab.onrender.com/</w:t>
       </w:r>
     </w:p>
     <w:p>
@@ -187,7 +228,7 @@
           <w:color w:val="000000"/>
           <w:sz w:val="22"/>
         </w:rPr>
-        <w:t>Na tela de autenticação, clique no menu suspenso ('Selecione seu Nome') e selecione o seu nome correspondente. Note que os discentes estão agrupados por suas respectivas equipes de estudo (ex: Equipe 1, Equipe 2).</w:t>
+        <w:t>Na tela de autenticação, clique no menu suspenso ('Selecione seu Nome') e selecione o seu nome correspondente.</w:t>
       </w:r>
     </w:p>
     <w:p>
@@ -214,7 +255,7 @@
           <w:color w:val="000000"/>
           <w:sz w:val="22"/>
         </w:rPr>
-        <w:t>No campo 'Senha', insira o seu endereço de e-mail acadêmico cadastrado (ex: nome.sobrenome@hmv.org.br).</w:t>
+        <w:t>No campo 'Senha', insira o seu endereço de e-mail acadêmico cadastrado no MBA (ex: nome.sobrenome@hmv.org.br).</w:t>
       </w:r>
     </w:p>
     <w:p>
@@ -255,95 +296,9 @@
           <w:b/>
           <w:i w:val="0"/>
           <w:color w:val="0284C7"/>
-          <w:sz w:val="26"/>
+          <w:sz w:val="25"/>
         </w:rPr>
-        <w:t>2. Configuração de Sincronização Síncrona</w:t>
-      </w:r>
-    </w:p>
-    <w:p>
-      <w:pPr>
-        <w:spacing w:line="276" w:lineRule="auto" w:after="120" w:before="0"/>
-        <w:jc w:val="both"/>
-      </w:pPr>
-      <w:r>
-        <w:rPr>
-          <w:rFonts w:ascii="Arial" w:hAnsi="Arial"/>
-          <w:b w:val="0"/>
-          <w:i w:val="0"/>
-          <w:color w:val="000000"/>
-          <w:sz w:val="22"/>
-        </w:rPr>
-        <w:t>Como o acompanhamento ocorre fora do horário síncrono, a condução automatizada da tela pela docente estará desativada. Para navegar de forma autônoma pelas abas e conteúdos:</w:t>
-      </w:r>
-    </w:p>
-    <w:p>
-      <w:pPr>
-        <w:pStyle w:val="ListBullet"/>
-        <w:spacing w:line="276" w:lineRule="auto" w:after="80" w:before="0"/>
-        <w:jc w:val="both"/>
-      </w:pPr>
-      <w:r>
-        <w:rPr>
-          <w:rFonts w:ascii="Arial" w:hAnsi="Arial"/>
-          <w:b/>
-          <w:i w:val="0"/>
-          <w:color w:val="000000"/>
-          <w:sz w:val="22"/>
-        </w:rPr>
-        <w:t xml:space="preserve">Desativação da Sincronização (Live Sync): </w:t>
-      </w:r>
-      <w:r>
-        <w:rPr>
-          <w:rFonts w:ascii="Arial" w:hAnsi="Arial"/>
-          <w:b w:val="0"/>
-          <w:i w:val="0"/>
-          <w:color w:val="000000"/>
-          <w:sz w:val="22"/>
-        </w:rPr>
-        <w:t>No cabeçalho superior do portal, localize o botão contendo o ícone de nuvem (Sincronização).</w:t>
-      </w:r>
-    </w:p>
-    <w:p>
-      <w:pPr>
-        <w:pStyle w:val="ListBullet"/>
-        <w:spacing w:line="276" w:lineRule="auto" w:after="80" w:before="0"/>
-        <w:jc w:val="both"/>
-      </w:pPr>
-      <w:r>
-        <w:rPr>
-          <w:rFonts w:ascii="Arial" w:hAnsi="Arial"/>
-          <w:b/>
-          <w:i w:val="0"/>
-          <w:color w:val="000000"/>
-          <w:sz w:val="22"/>
-        </w:rPr>
-        <w:t xml:space="preserve">Controle Local: </w:t>
-      </w:r>
-      <w:r>
-        <w:rPr>
-          <w:rFonts w:ascii="Arial" w:hAnsi="Arial"/>
-          <w:b w:val="0"/>
-          <w:i w:val="0"/>
-          <w:color w:val="000000"/>
-          <w:sz w:val="22"/>
-        </w:rPr>
-        <w:t>Clique no botão para desativar a sincronização (o ícone ficará em cinza e a mensagem indicará 'Sincronização Desativada'). Com este procedimento, você assume o controle manual de avanço dos slides e transição de abas.</w:t>
-      </w:r>
-    </w:p>
-    <w:p>
-      <w:pPr>
-        <w:keepNext/>
-        <w:spacing w:before="280" w:after="80" w:line="276" w:lineRule="auto"/>
-      </w:pPr>
-      <w:r>
-        <w:rPr>
-          <w:rFonts w:ascii="Arial" w:hAnsi="Arial"/>
-          <w:b/>
-          <w:i w:val="0"/>
-          <w:color w:val="0284C7"/>
-          <w:sz w:val="26"/>
-        </w:rPr>
-        <w:t>3. Protocolo de Estudo Integrado com a Gravação</w:t>
+        <w:t>2. Estudo Integrado com a Gravação</w:t>
       </w:r>
     </w:p>
     <w:p>
@@ -418,60 +373,6 @@
     </w:p>
     <w:p>
       <w:pPr>
-        <w:pStyle w:val="ListBullet"/>
-        <w:spacing w:line="276" w:lineRule="auto" w:after="80" w:before="0"/>
-        <w:jc w:val="both"/>
-      </w:pPr>
-      <w:r>
-        <w:rPr>
-          <w:rFonts w:ascii="Arial" w:hAnsi="Arial"/>
-          <w:b/>
-          <w:i w:val="0"/>
-          <w:color w:val="000000"/>
-          <w:sz w:val="22"/>
-        </w:rPr>
-        <w:t xml:space="preserve">Participação em Enquetes de Fixação: </w:t>
-      </w:r>
-      <w:r>
-        <w:rPr>
-          <w:rFonts w:ascii="Arial" w:hAnsi="Arial"/>
-          <w:b w:val="0"/>
-          <w:i w:val="0"/>
-          <w:color w:val="000000"/>
-          <w:sz w:val="22"/>
-        </w:rPr>
-        <w:t>Quando a docente solicitar o preenchimento de enquetes rápidas (Check-in, Quizzes de fixação ou Reflexão Final), acesse a aba correspondente no cabeçalho do portal, responda às perguntas e clique em enviar.</w:t>
-      </w:r>
-    </w:p>
-    <w:p>
-      <w:pPr>
-        <w:pStyle w:val="ListBullet"/>
-        <w:spacing w:line="276" w:lineRule="auto" w:after="80" w:before="0"/>
-        <w:jc w:val="both"/>
-      </w:pPr>
-      <w:r>
-        <w:rPr>
-          <w:rFonts w:ascii="Arial" w:hAnsi="Arial"/>
-          <w:b/>
-          <w:i w:val="0"/>
-          <w:color w:val="000000"/>
-          <w:sz w:val="22"/>
-        </w:rPr>
-        <w:t xml:space="preserve">Interação na Nuvem de Palavras: </w:t>
-      </w:r>
-      <w:r>
-        <w:rPr>
-          <w:rFonts w:ascii="Arial" w:hAnsi="Arial"/>
-          <w:b w:val="0"/>
-          <w:i w:val="0"/>
-          <w:color w:val="000000"/>
-          <w:sz w:val="22"/>
-        </w:rPr>
-        <w:t>Você pode interagir com as respostas dos seus pares. Dê um toque duplo (em telas touch) ou clique duplo nas palavras chaves da nuvem para curtir e registrar sua concordância conceitual.</w:t>
-      </w:r>
-    </w:p>
-    <w:p>
-      <w:pPr>
         <w:keepNext/>
         <w:spacing w:before="280" w:after="80" w:line="276" w:lineRule="auto"/>
       </w:pPr>
@@ -481,9 +382,9 @@
           <w:b/>
           <w:i w:val="0"/>
           <w:color w:val="0284C7"/>
-          <w:sz w:val="26"/>
+          <w:sz w:val="25"/>
         </w:rPr>
-        <w:t>4. Realização e Entrega de Atividades Práticas (Trabalho de Equipe)</w:t>
+        <w:t>3. Realização e Entrega de Atividades Práticas (Trabalho de Equipe)</w:t>
       </w:r>
     </w:p>
     <w:p>
@@ -581,60 +482,6 @@
           <w:sz w:val="22"/>
         </w:rPr>
         <w:t>Após completar o preenchimento, clique no botão 'Submeter' no rodapé do formulário.</w:t>
-      </w:r>
-    </w:p>
-    <w:p>
-      <w:pPr>
-        <w:pStyle w:val="ListBullet"/>
-        <w:spacing w:line="276" w:lineRule="auto" w:after="80" w:before="0"/>
-        <w:jc w:val="both"/>
-      </w:pPr>
-      <w:r>
-        <w:rPr>
-          <w:rFonts w:ascii="Arial" w:hAnsi="Arial"/>
-          <w:b/>
-          <w:i w:val="0"/>
-          <w:color w:val="000000"/>
-          <w:sz w:val="22"/>
-        </w:rPr>
-        <w:t xml:space="preserve">Avaliação Docente: </w:t>
-      </w:r>
-      <w:r>
-        <w:rPr>
-          <w:rFonts w:ascii="Arial" w:hAnsi="Arial"/>
-          <w:b w:val="0"/>
-          <w:i w:val="0"/>
-          <w:color w:val="000000"/>
-          <w:sz w:val="22"/>
-        </w:rPr>
-        <w:t>Sua submissão será armazenada em banco de dados sob o seu e-mail de discente. A docente Faila Santos revisará suas respostas e publicará feedbacks individuais de orientação diretamente no seu portal.</w:t>
-      </w:r>
-    </w:p>
-    <w:p>
-      <w:pPr>
-        <w:pStyle w:val="ListBullet"/>
-        <w:spacing w:line="276" w:lineRule="auto" w:after="80" w:before="0"/>
-        <w:jc w:val="both"/>
-      </w:pPr>
-      <w:r>
-        <w:rPr>
-          <w:rFonts w:ascii="Arial" w:hAnsi="Arial"/>
-          <w:b/>
-          <w:i w:val="0"/>
-          <w:color w:val="000000"/>
-          <w:sz w:val="22"/>
-        </w:rPr>
-        <w:t xml:space="preserve">Visualização de Feedbacks: </w:t>
-      </w:r>
-      <w:r>
-        <w:rPr>
-          <w:rFonts w:ascii="Arial" w:hAnsi="Arial"/>
-          <w:b w:val="0"/>
-          <w:i w:val="0"/>
-          <w:color w:val="000000"/>
-          <w:sz w:val="22"/>
-        </w:rPr>
-        <w:t>Os comentários e retornos pedagógicos da docente estarão disponíveis para consulta no rodapé da própria aba 'Trabalho em Grupo'.</w:t>
       </w:r>
     </w:p>
     <w:sectPr>

</xml_diff>